<commit_message>
updated: diagrams and docs
</commit_message>
<xml_diff>
--- a/docs/functional-requirements.docx
+++ b/docs/functional-requirements.docx
@@ -4,13 +4,12 @@
   <w:body>
     <w:p>
       <w:pPr>
+        <w:pStyle w:val="Title"/>
         <w:jc w:val="center"/>
       </w:pPr>
       <w:r>
         <w:rPr>
           <w:b/>
-          <w:color w:val="1F4E79"/>
-          <w:sz w:val="40"/>
         </w:rPr>
         <w:t>Functional / Software Requirements</w:t>
       </w:r>
@@ -22,818 +21,910 @@
       <w:r>
         <w:rPr>
           <w:i/>
+          <w:color w:val="555555"/>
+          <w:sz w:val="22"/>
         </w:rPr>
-        <w:t>CSCI370 Renter Dispute Resolution Application</w:t>
+        <w:t>CSCI370 Renter Dispute Assistant</w:t>
       </w:r>
     </w:p>
-    <w:p/>
-    <w:tbl>
-      <w:tblPr>
-        <w:tblStyle w:val="TableGrid"/>
-        <w:tblW w:w="0" w:type="auto"/>
-        <w:jc w:val="center"/>
-        <w:tblLook w:val="04A0" w:firstRow="1" w:lastRow="0" w:firstColumn="1" w:lastColumn="0" w:noHBand="0" w:noVBand="1"/>
-      </w:tblPr>
-      <w:tblGrid>
-        <w:gridCol w:w="5184"/>
-        <w:gridCol w:w="5184"/>
-      </w:tblGrid>
-      <w:tr>
-        <w:trPr>
-          <w:jc w:val="center"/>
-        </w:trPr>
-        <w:tc>
-          <w:tcPr>
-            <w:tcW w:w="5184" w:type="dxa"/>
-            <w:shd w:val="clear" w:color="auto" w:fill="1F4E79"/>
-            <w:vAlign w:val="center"/>
-          </w:tcPr>
-          <w:p>
-            <w:r>
-              <w:rPr>
-                <w:b/>
-                <w:color w:val="FFFFFF"/>
-              </w:rPr>
-              <w:t>ID</w:t>
-            </w:r>
-          </w:p>
-        </w:tc>
-        <w:tc>
-          <w:tcPr>
-            <w:tcW w:w="5184" w:type="dxa"/>
-            <w:shd w:val="clear" w:color="auto" w:fill="1F4E79"/>
-            <w:vAlign w:val="center"/>
-          </w:tcPr>
-          <w:p>
-            <w:r>
-              <w:rPr>
-                <w:b/>
-                <w:color w:val="FFFFFF"/>
-              </w:rPr>
-              <w:t>Functional Requirement</w:t>
-            </w:r>
-          </w:p>
-        </w:tc>
-      </w:tr>
-      <w:tr>
-        <w:trPr>
-          <w:jc w:val="center"/>
-        </w:trPr>
-        <w:tc>
-          <w:tcPr>
-            <w:tcW w:w="5184" w:type="dxa"/>
-            <w:vAlign w:val="center"/>
-          </w:tcPr>
-          <w:p>
-            <w:r>
-              <w:rPr>
-                <w:b/>
-              </w:rPr>
-              <w:t>FR1</w:t>
-            </w:r>
-          </w:p>
-        </w:tc>
-        <w:tc>
-          <w:tcPr>
-            <w:tcW w:w="5184" w:type="dxa"/>
-            <w:vAlign w:val="center"/>
-          </w:tcPr>
-          <w:p>
-            <w:r>
-              <w:t>When a new user registers, the application shall create an account using required identity and contact information.</w:t>
-            </w:r>
-          </w:p>
-        </w:tc>
-      </w:tr>
-      <w:tr>
-        <w:trPr>
-          <w:jc w:val="center"/>
-        </w:trPr>
-        <w:tc>
-          <w:tcPr>
-            <w:tcW w:w="5184" w:type="dxa"/>
-            <w:shd w:val="clear" w:color="auto" w:fill="F3F8FC"/>
-            <w:vAlign w:val="center"/>
-          </w:tcPr>
-          <w:p>
-            <w:r>
-              <w:rPr>
-                <w:b/>
-              </w:rPr>
-              <w:t>FR2</w:t>
-            </w:r>
-          </w:p>
-        </w:tc>
-        <w:tc>
-          <w:tcPr>
-            <w:tcW w:w="5184" w:type="dxa"/>
-            <w:shd w:val="clear" w:color="auto" w:fill="F3F8FC"/>
-            <w:vAlign w:val="center"/>
-          </w:tcPr>
-          <w:p>
-            <w:r>
-              <w:t>When a registered user logs in, the application shall authenticate the user before allowing access to protected dispute features.</w:t>
-            </w:r>
-          </w:p>
-        </w:tc>
-      </w:tr>
-      <w:tr>
-        <w:trPr>
-          <w:jc w:val="center"/>
-        </w:trPr>
-        <w:tc>
-          <w:tcPr>
-            <w:tcW w:w="5184" w:type="dxa"/>
-            <w:vAlign w:val="center"/>
-          </w:tcPr>
-          <w:p>
-            <w:r>
-              <w:rPr>
-                <w:b/>
-              </w:rPr>
-              <w:t>FR3</w:t>
-            </w:r>
-          </w:p>
-        </w:tc>
-        <w:tc>
-          <w:tcPr>
-            <w:tcW w:w="5184" w:type="dxa"/>
-            <w:vAlign w:val="center"/>
-          </w:tcPr>
-          <w:p>
-            <w:r>
-              <w:t>When a renter starts a case, the application shall ask whether the issue is related to a security deposit, maintenance problem, or another housing dispute.</w:t>
-            </w:r>
-          </w:p>
-        </w:tc>
-      </w:tr>
-      <w:tr>
-        <w:trPr>
-          <w:jc w:val="center"/>
-        </w:trPr>
-        <w:tc>
-          <w:tcPr>
-            <w:tcW w:w="5184" w:type="dxa"/>
-            <w:shd w:val="clear" w:color="auto" w:fill="F3F8FC"/>
-            <w:vAlign w:val="center"/>
-          </w:tcPr>
-          <w:p>
-            <w:r>
-              <w:rPr>
-                <w:b/>
-              </w:rPr>
-              <w:t>FR4</w:t>
-            </w:r>
-          </w:p>
-        </w:tc>
-        <w:tc>
-          <w:tcPr>
-            <w:tcW w:w="5184" w:type="dxa"/>
-            <w:shd w:val="clear" w:color="auto" w:fill="F3F8FC"/>
-            <w:vAlign w:val="center"/>
-          </w:tcPr>
-          <w:p>
-            <w:r>
-              <w:t>When a renter answers intake questions, the application shall save the responses as structured case information.</w:t>
-            </w:r>
-          </w:p>
-        </w:tc>
-      </w:tr>
-      <w:tr>
-        <w:trPr>
-          <w:jc w:val="center"/>
-        </w:trPr>
-        <w:tc>
-          <w:tcPr>
-            <w:tcW w:w="5184" w:type="dxa"/>
-            <w:vAlign w:val="center"/>
-          </w:tcPr>
-          <w:p>
-            <w:r>
-              <w:rPr>
-                <w:b/>
-              </w:rPr>
-              <w:t>FR5</w:t>
-            </w:r>
-          </w:p>
-        </w:tc>
-        <w:tc>
-          <w:tcPr>
-            <w:tcW w:w="5184" w:type="dxa"/>
-            <w:vAlign w:val="center"/>
-          </w:tcPr>
-          <w:p>
-            <w:r>
-              <w:t>When required information is missing from the intake form, the application shall show validation messages before allowing submission.</w:t>
-            </w:r>
-          </w:p>
-        </w:tc>
-      </w:tr>
-      <w:tr>
-        <w:trPr>
-          <w:jc w:val="center"/>
-        </w:trPr>
-        <w:tc>
-          <w:tcPr>
-            <w:tcW w:w="5184" w:type="dxa"/>
-            <w:shd w:val="clear" w:color="auto" w:fill="F3F8FC"/>
-            <w:vAlign w:val="center"/>
-          </w:tcPr>
-          <w:p>
-            <w:r>
-              <w:rPr>
-                <w:b/>
-              </w:rPr>
-              <w:t>FR6</w:t>
-            </w:r>
-          </w:p>
-        </w:tc>
-        <w:tc>
-          <w:tcPr>
-            <w:tcW w:w="5184" w:type="dxa"/>
-            <w:shd w:val="clear" w:color="auto" w:fill="F3F8FC"/>
-            <w:vAlign w:val="center"/>
-          </w:tcPr>
-          <w:p>
-            <w:r>
-              <w:t>When a renter creates a security deposit dispute, the application shall collect move-in date, move-out date, deposit amount, deductions, and return status.</w:t>
-            </w:r>
-          </w:p>
-        </w:tc>
-      </w:tr>
-      <w:tr>
-        <w:trPr>
-          <w:jc w:val="center"/>
-        </w:trPr>
-        <w:tc>
-          <w:tcPr>
-            <w:tcW w:w="5184" w:type="dxa"/>
-            <w:vAlign w:val="center"/>
-          </w:tcPr>
-          <w:p>
-            <w:r>
-              <w:rPr>
-                <w:b/>
-              </w:rPr>
-              <w:t>FR7</w:t>
-            </w:r>
-          </w:p>
-        </w:tc>
-        <w:tc>
-          <w:tcPr>
-            <w:tcW w:w="5184" w:type="dxa"/>
-            <w:vAlign w:val="center"/>
-          </w:tcPr>
-          <w:p>
-            <w:r>
-              <w:t>When a renter creates a maintenance dispute, the application shall collect issue type, dates reported, communication history, and current condition.</w:t>
-            </w:r>
-          </w:p>
-        </w:tc>
-      </w:tr>
-      <w:tr>
-        <w:trPr>
-          <w:jc w:val="center"/>
-        </w:trPr>
-        <w:tc>
-          <w:tcPr>
-            <w:tcW w:w="5184" w:type="dxa"/>
-            <w:shd w:val="clear" w:color="auto" w:fill="F3F8FC"/>
-            <w:vAlign w:val="center"/>
-          </w:tcPr>
-          <w:p>
-            <w:r>
-              <w:rPr>
-                <w:b/>
-              </w:rPr>
-              <w:t>FR8</w:t>
-            </w:r>
-          </w:p>
-        </w:tc>
-        <w:tc>
-          <w:tcPr>
-            <w:tcW w:w="5184" w:type="dxa"/>
-            <w:shd w:val="clear" w:color="auto" w:fill="F3F8FC"/>
-            <w:vAlign w:val="center"/>
-          </w:tcPr>
-          <w:p>
-            <w:r>
-              <w:t>When a user uploads evidence, the application shall store the file and associate it with the correct dispute case.</w:t>
-            </w:r>
-          </w:p>
-        </w:tc>
-      </w:tr>
-      <w:tr>
-        <w:trPr>
-          <w:jc w:val="center"/>
-        </w:trPr>
-        <w:tc>
-          <w:tcPr>
-            <w:tcW w:w="5184" w:type="dxa"/>
-            <w:vAlign w:val="center"/>
-          </w:tcPr>
-          <w:p>
-            <w:r>
-              <w:rPr>
-                <w:b/>
-              </w:rPr>
-              <w:t>FR9</w:t>
-            </w:r>
-          </w:p>
-        </w:tc>
-        <w:tc>
-          <w:tcPr>
-            <w:tcW w:w="5184" w:type="dxa"/>
-            <w:vAlign w:val="center"/>
-          </w:tcPr>
-          <w:p>
-            <w:r>
-              <w:t>When a user uploads unsupported or oversized evidence, the application shall reject the file and explain the reason.</w:t>
-            </w:r>
-          </w:p>
-        </w:tc>
-      </w:tr>
-      <w:tr>
-        <w:trPr>
-          <w:jc w:val="center"/>
-        </w:trPr>
-        <w:tc>
-          <w:tcPr>
-            <w:tcW w:w="5184" w:type="dxa"/>
-            <w:shd w:val="clear" w:color="auto" w:fill="F3F8FC"/>
-            <w:vAlign w:val="center"/>
-          </w:tcPr>
-          <w:p>
-            <w:r>
-              <w:rPr>
-                <w:b/>
-              </w:rPr>
-              <w:t>FR10</w:t>
-            </w:r>
-          </w:p>
-        </w:tc>
-        <w:tc>
-          <w:tcPr>
-            <w:tcW w:w="5184" w:type="dxa"/>
-            <w:shd w:val="clear" w:color="auto" w:fill="F3F8FC"/>
-            <w:vAlign w:val="center"/>
-          </w:tcPr>
-          <w:p>
-            <w:r>
-              <w:t>When a renter requests form generation, the application shall use saved case information to populate the required dispute form fields.</w:t>
-            </w:r>
-          </w:p>
-        </w:tc>
-      </w:tr>
-      <w:tr>
-        <w:trPr>
-          <w:jc w:val="center"/>
-        </w:trPr>
-        <w:tc>
-          <w:tcPr>
-            <w:tcW w:w="5184" w:type="dxa"/>
-            <w:vAlign w:val="center"/>
-          </w:tcPr>
-          <w:p>
-            <w:r>
-              <w:rPr>
-                <w:b/>
-              </w:rPr>
-              <w:t>FR11</w:t>
-            </w:r>
-          </w:p>
-        </w:tc>
-        <w:tc>
-          <w:tcPr>
-            <w:tcW w:w="5184" w:type="dxa"/>
-            <w:vAlign w:val="center"/>
-          </w:tcPr>
-          <w:p>
-            <w:r>
-              <w:t>When a generated form is complete, the application shall allow the renter to preview and download the form.</w:t>
-            </w:r>
-          </w:p>
-        </w:tc>
-      </w:tr>
-      <w:tr>
-        <w:trPr>
-          <w:jc w:val="center"/>
-        </w:trPr>
-        <w:tc>
-          <w:tcPr>
-            <w:tcW w:w="5184" w:type="dxa"/>
-            <w:shd w:val="clear" w:color="auto" w:fill="F3F8FC"/>
-            <w:vAlign w:val="center"/>
-          </w:tcPr>
-          <w:p>
-            <w:r>
-              <w:rPr>
-                <w:b/>
-              </w:rPr>
-              <w:t>FR12</w:t>
-            </w:r>
-          </w:p>
-        </w:tc>
-        <w:tc>
-          <w:tcPr>
-            <w:tcW w:w="5184" w:type="dxa"/>
-            <w:shd w:val="clear" w:color="auto" w:fill="F3F8FC"/>
-            <w:vAlign w:val="center"/>
-          </w:tcPr>
-          <w:p>
-            <w:r>
-              <w:t>When a landlord or property manager is invited to a case, the application shall allow that user to view the renter's claim and submit a response.</w:t>
-            </w:r>
-          </w:p>
-        </w:tc>
-      </w:tr>
-      <w:tr>
-        <w:trPr>
-          <w:jc w:val="center"/>
-        </w:trPr>
-        <w:tc>
-          <w:tcPr>
-            <w:tcW w:w="5184" w:type="dxa"/>
-            <w:vAlign w:val="center"/>
-          </w:tcPr>
-          <w:p>
-            <w:r>
-              <w:rPr>
-                <w:b/>
-              </w:rPr>
-              <w:t>FR13</w:t>
-            </w:r>
-          </w:p>
-        </w:tc>
-        <w:tc>
-          <w:tcPr>
-            <w:tcW w:w="5184" w:type="dxa"/>
-            <w:vAlign w:val="center"/>
-          </w:tcPr>
-          <w:p>
-            <w:r>
-              <w:t>When both sides submit their positions, the application shall prepare the case information for AI arbitration.</w:t>
-            </w:r>
-          </w:p>
-        </w:tc>
-      </w:tr>
-      <w:tr>
-        <w:trPr>
-          <w:jc w:val="center"/>
-        </w:trPr>
-        <w:tc>
-          <w:tcPr>
-            <w:tcW w:w="5184" w:type="dxa"/>
-            <w:shd w:val="clear" w:color="auto" w:fill="F3F8FC"/>
-            <w:vAlign w:val="center"/>
-          </w:tcPr>
-          <w:p>
-            <w:r>
-              <w:rPr>
-                <w:b/>
-              </w:rPr>
-              <w:t>FR14</w:t>
-            </w:r>
-          </w:p>
-        </w:tc>
-        <w:tc>
-          <w:tcPr>
-            <w:tcW w:w="5184" w:type="dxa"/>
-            <w:shd w:val="clear" w:color="auto" w:fill="F3F8FC"/>
-            <w:vAlign w:val="center"/>
-          </w:tcPr>
-          <w:p>
-            <w:r>
-              <w:t>When AI arbitration is requested, the application shall send relevant claim details, responses, and evidence summaries to the AI arbitration service.</w:t>
-            </w:r>
-          </w:p>
-        </w:tc>
-      </w:tr>
-      <w:tr>
-        <w:trPr>
-          <w:jc w:val="center"/>
-        </w:trPr>
-        <w:tc>
-          <w:tcPr>
-            <w:tcW w:w="5184" w:type="dxa"/>
-            <w:vAlign w:val="center"/>
-          </w:tcPr>
-          <w:p>
-            <w:r>
-              <w:rPr>
-                <w:b/>
-              </w:rPr>
-              <w:t>FR15</w:t>
-            </w:r>
-          </w:p>
-        </w:tc>
-        <w:tc>
-          <w:tcPr>
-            <w:tcW w:w="5184" w:type="dxa"/>
-            <w:vAlign w:val="center"/>
-          </w:tcPr>
-          <w:p>
-            <w:r>
-              <w:t>When the AI arbitration service returns a result, the application shall display a neutral summary, key facts, disputed issues, and suggested resolution.</w:t>
-            </w:r>
-          </w:p>
-        </w:tc>
-      </w:tr>
-      <w:tr>
-        <w:trPr>
-          <w:jc w:val="center"/>
-        </w:trPr>
-        <w:tc>
-          <w:tcPr>
-            <w:tcW w:w="5184" w:type="dxa"/>
-            <w:shd w:val="clear" w:color="auto" w:fill="F3F8FC"/>
-            <w:vAlign w:val="center"/>
-          </w:tcPr>
-          <w:p>
-            <w:r>
-              <w:rPr>
-                <w:b/>
-              </w:rPr>
-              <w:t>FR16</w:t>
-            </w:r>
-          </w:p>
-        </w:tc>
-        <w:tc>
-          <w:tcPr>
-            <w:tcW w:w="5184" w:type="dxa"/>
-            <w:shd w:val="clear" w:color="auto" w:fill="F3F8FC"/>
-            <w:vAlign w:val="center"/>
-          </w:tcPr>
-          <w:p>
-            <w:r>
-              <w:t>When the AI arbitrator cites case evidence, the application shall show which uploaded item or submitted answer supports that point.</w:t>
-            </w:r>
-          </w:p>
-        </w:tc>
-      </w:tr>
-      <w:tr>
-        <w:trPr>
-          <w:jc w:val="center"/>
-        </w:trPr>
-        <w:tc>
-          <w:tcPr>
-            <w:tcW w:w="5184" w:type="dxa"/>
-            <w:vAlign w:val="center"/>
-          </w:tcPr>
-          <w:p>
-            <w:r>
-              <w:rPr>
-                <w:b/>
-              </w:rPr>
-              <w:t>FR17</w:t>
-            </w:r>
-          </w:p>
-        </w:tc>
-        <w:tc>
-          <w:tcPr>
-            <w:tcW w:w="5184" w:type="dxa"/>
-            <w:vAlign w:val="center"/>
-          </w:tcPr>
-          <w:p>
-            <w:r>
-              <w:t>When the AI arbitrator cannot make a confident recommendation, the application may mark the result as inconclusive and ask for more information.</w:t>
-            </w:r>
-          </w:p>
-        </w:tc>
-      </w:tr>
-      <w:tr>
-        <w:trPr>
-          <w:jc w:val="center"/>
-        </w:trPr>
-        <w:tc>
-          <w:tcPr>
-            <w:tcW w:w="5184" w:type="dxa"/>
-            <w:shd w:val="clear" w:color="auto" w:fill="F3F8FC"/>
-            <w:vAlign w:val="center"/>
-          </w:tcPr>
-          <w:p>
-            <w:r>
-              <w:rPr>
-                <w:b/>
-              </w:rPr>
-              <w:t>FR18</w:t>
-            </w:r>
-          </w:p>
-        </w:tc>
-        <w:tc>
-          <w:tcPr>
-            <w:tcW w:w="5184" w:type="dxa"/>
-            <w:shd w:val="clear" w:color="auto" w:fill="F3F8FC"/>
-            <w:vAlign w:val="center"/>
-          </w:tcPr>
-          <w:p>
-            <w:r>
-              <w:t>When either party views an AI result, the application shall display that the result is a non-binding project-</w:t>
-            </w:r>
-            <w:r>
-              <w:lastRenderedPageBreak/>
-              <w:t>generated recommendation.</w:t>
-            </w:r>
-          </w:p>
-        </w:tc>
-      </w:tr>
-      <w:tr>
-        <w:trPr>
-          <w:jc w:val="center"/>
-        </w:trPr>
-        <w:tc>
-          <w:tcPr>
-            <w:tcW w:w="5184" w:type="dxa"/>
-            <w:vAlign w:val="center"/>
-          </w:tcPr>
-          <w:p>
-            <w:r>
-              <w:rPr>
-                <w:b/>
-              </w:rPr>
-              <w:lastRenderedPageBreak/>
-              <w:t>FR19</w:t>
-            </w:r>
-          </w:p>
-        </w:tc>
-        <w:tc>
-          <w:tcPr>
-            <w:tcW w:w="5184" w:type="dxa"/>
-            <w:vAlign w:val="center"/>
-          </w:tcPr>
-          <w:p>
-            <w:r>
-              <w:t>When a dispute status changes, the application shall update the case timeline.</w:t>
-            </w:r>
-          </w:p>
-        </w:tc>
-      </w:tr>
-      <w:tr>
-        <w:trPr>
-          <w:jc w:val="center"/>
-        </w:trPr>
-        <w:tc>
-          <w:tcPr>
-            <w:tcW w:w="5184" w:type="dxa"/>
-            <w:shd w:val="clear" w:color="auto" w:fill="F3F8FC"/>
-            <w:vAlign w:val="center"/>
-          </w:tcPr>
-          <w:p>
-            <w:r>
-              <w:rPr>
-                <w:b/>
-              </w:rPr>
-              <w:t>FR20</w:t>
-            </w:r>
-          </w:p>
-        </w:tc>
-        <w:tc>
-          <w:tcPr>
-            <w:tcW w:w="5184" w:type="dxa"/>
-            <w:shd w:val="clear" w:color="auto" w:fill="F3F8FC"/>
-            <w:vAlign w:val="center"/>
-          </w:tcPr>
-          <w:p>
-            <w:r>
-              <w:t>When an administrator reviews a case, the application shall allow the administrator to moderate inappropriate content or disable a case.</w:t>
-            </w:r>
-          </w:p>
-        </w:tc>
-      </w:tr>
-      <w:tr>
-        <w:trPr>
-          <w:jc w:val="center"/>
-        </w:trPr>
-        <w:tc>
-          <w:tcPr>
-            <w:tcW w:w="5184" w:type="dxa"/>
-            <w:vAlign w:val="center"/>
-          </w:tcPr>
-          <w:p>
-            <w:r>
-              <w:rPr>
-                <w:b/>
-              </w:rPr>
-              <w:t>FR21</w:t>
-            </w:r>
-          </w:p>
-        </w:tc>
-        <w:tc>
-          <w:tcPr>
-            <w:tcW w:w="5184" w:type="dxa"/>
-            <w:vAlign w:val="center"/>
-          </w:tcPr>
-          <w:p>
-            <w:r>
-              <w:t>When a user tries to access a case they do not own or participate in, the application shall deny access.</w:t>
-            </w:r>
-          </w:p>
-        </w:tc>
-      </w:tr>
-      <w:tr>
-        <w:trPr>
-          <w:jc w:val="center"/>
-        </w:trPr>
-        <w:tc>
-          <w:tcPr>
-            <w:tcW w:w="5184" w:type="dxa"/>
-            <w:shd w:val="clear" w:color="auto" w:fill="F3F8FC"/>
-            <w:vAlign w:val="center"/>
-          </w:tcPr>
-          <w:p>
-            <w:r>
-              <w:rPr>
-                <w:b/>
-              </w:rPr>
-              <w:t>FR22</w:t>
-            </w:r>
-          </w:p>
-        </w:tc>
-        <w:tc>
-          <w:tcPr>
-            <w:tcW w:w="5184" w:type="dxa"/>
-            <w:shd w:val="clear" w:color="auto" w:fill="F3F8FC"/>
-            <w:vAlign w:val="center"/>
-          </w:tcPr>
-          <w:p>
-            <w:r>
-              <w:t>When a dispute case is deleted or closed, the application shall preserve required audit information for project traceability.</w:t>
-            </w:r>
-          </w:p>
-        </w:tc>
-      </w:tr>
-      <w:tr>
-        <w:trPr>
-          <w:jc w:val="center"/>
-        </w:trPr>
-        <w:tc>
-          <w:tcPr>
-            <w:tcW w:w="5184" w:type="dxa"/>
-            <w:vAlign w:val="center"/>
-          </w:tcPr>
-          <w:p>
-            <w:r>
-              <w:rPr>
-                <w:b/>
-              </w:rPr>
-              <w:t>FR23</w:t>
-            </w:r>
-          </w:p>
-        </w:tc>
-        <w:tc>
-          <w:tcPr>
-            <w:tcW w:w="5184" w:type="dxa"/>
-            <w:vAlign w:val="center"/>
-          </w:tcPr>
-          <w:p>
-            <w:r>
-              <w:t>When a user views their dashboard, the application shall show active disputes, pending actions, and completed cases.</w:t>
-            </w:r>
-          </w:p>
-        </w:tc>
-      </w:tr>
-      <w:tr>
-        <w:trPr>
-          <w:jc w:val="center"/>
-        </w:trPr>
-        <w:tc>
-          <w:tcPr>
-            <w:tcW w:w="5184" w:type="dxa"/>
-            <w:shd w:val="clear" w:color="auto" w:fill="F3F8FC"/>
-            <w:vAlign w:val="center"/>
-          </w:tcPr>
-          <w:p>
-            <w:r>
-              <w:rPr>
-                <w:b/>
-              </w:rPr>
-              <w:t>FR24</w:t>
-            </w:r>
-          </w:p>
-        </w:tc>
-        <w:tc>
-          <w:tcPr>
-            <w:tcW w:w="5184" w:type="dxa"/>
-            <w:shd w:val="clear" w:color="auto" w:fill="F3F8FC"/>
-            <w:vAlign w:val="center"/>
-          </w:tcPr>
-          <w:p>
-            <w:r>
-              <w:t>When a form or AI summary is generated, the application shall store a timestamped record of the generated artifact.</w:t>
-            </w:r>
-          </w:p>
-        </w:tc>
-      </w:tr>
-    </w:tbl>
-    <w:p/>
+    <w:p>
+      <w:pPr>
+        <w:pStyle w:val="Heading1"/>
+      </w:pPr>
+      <w:r>
+        <w:t>Functional / Software Requirements</w:t>
+      </w:r>
+    </w:p>
+    <w:p>
+      <w:pPr>
+        <w:pStyle w:val="Heading2"/>
+        <w:spacing w:before="80" w:after="20"/>
+      </w:pPr>
+      <w:r>
+        <w:t>FR1</w:t>
+      </w:r>
+    </w:p>
+    <w:p>
+      <w:pPr>
+        <w:spacing w:after="100"/>
+        <w:ind w:left="216"/>
+      </w:pPr>
+      <w:r>
+        <w:t>When a renter starts a new case, the application shall display a guided intake flow for official renter dispute paperwork.</w:t>
+      </w:r>
+    </w:p>
+    <w:p>
+      <w:pPr>
+        <w:pStyle w:val="Heading2"/>
+        <w:spacing w:before="80" w:after="20"/>
+      </w:pPr>
+      <w:r>
+        <w:t>FR2</w:t>
+      </w:r>
+    </w:p>
+    <w:p>
+      <w:pPr>
+        <w:spacing w:after="100"/>
+        <w:ind w:left="216"/>
+      </w:pPr>
+      <w:r>
+        <w:t>When a renter selects a dispute category, the application shall record the selected dispute type for form routing and case creation.</w:t>
+      </w:r>
+    </w:p>
+    <w:p>
+      <w:pPr>
+        <w:pStyle w:val="Heading2"/>
+        <w:spacing w:before="80" w:after="20"/>
+      </w:pPr>
+      <w:r>
+        <w:t>FR3</w:t>
+      </w:r>
+    </w:p>
+    <w:p>
+      <w:pPr>
+        <w:spacing w:after="100"/>
+        <w:ind w:left="216"/>
+      </w:pPr>
+      <w:r>
+        <w:t>When a renter enters their city, state, or jurisdiction, the application shall use that location as part of the form selection process.</w:t>
+      </w:r>
+    </w:p>
+    <w:p>
+      <w:pPr>
+        <w:pStyle w:val="Heading2"/>
+        <w:spacing w:before="80" w:after="20"/>
+      </w:pPr>
+      <w:r>
+        <w:t>FR4</w:t>
+      </w:r>
+    </w:p>
+    <w:p>
+      <w:pPr>
+        <w:spacing w:after="100"/>
+        <w:ind w:left="216"/>
+      </w:pPr>
+      <w:r>
+        <w:t>When a renter selects a supported dispute type and jurisdiction, the application shall use internal form-routing rules to determine the relevant supported official form or document template.</w:t>
+      </w:r>
+    </w:p>
+    <w:p>
+      <w:pPr>
+        <w:pStyle w:val="Heading2"/>
+        <w:spacing w:before="80" w:after="20"/>
+      </w:pPr>
+      <w:r>
+        <w:t>FR5</w:t>
+      </w:r>
+    </w:p>
+    <w:p>
+      <w:pPr>
+        <w:spacing w:after="100"/>
+        <w:ind w:left="216"/>
+      </w:pPr>
+      <w:r>
+        <w:t>When a renter selects an unsupported dispute type or jurisdiction, the application shall display a clear message that no supported official form template is available.</w:t>
+      </w:r>
+    </w:p>
+    <w:p>
+      <w:pPr>
+        <w:pStyle w:val="Heading2"/>
+        <w:spacing w:before="80" w:after="20"/>
+      </w:pPr>
+      <w:r>
+        <w:t>FR6</w:t>
+      </w:r>
+    </w:p>
+    <w:p>
+      <w:pPr>
+        <w:spacing w:after="100"/>
+        <w:ind w:left="216"/>
+      </w:pPr>
+      <w:r>
+        <w:t>When no supported official form template is available, the application may generate a general dispute summary document for renter review.</w:t>
+      </w:r>
+    </w:p>
+    <w:p>
+      <w:pPr>
+        <w:pStyle w:val="Heading2"/>
+        <w:spacing w:before="80" w:after="20"/>
+      </w:pPr>
+      <w:r>
+        <w:t>FR7</w:t>
+      </w:r>
+    </w:p>
+    <w:p>
+      <w:pPr>
+        <w:spacing w:after="100"/>
+        <w:ind w:left="216"/>
+      </w:pPr>
+      <w:r>
+        <w:t>When a supported form template is selected, the application shall display guided questions required for that template.</w:t>
+      </w:r>
+    </w:p>
+    <w:p>
+      <w:pPr>
+        <w:pStyle w:val="Heading2"/>
+        <w:spacing w:before="80" w:after="20"/>
+      </w:pPr>
+      <w:r>
+        <w:t>FR8</w:t>
+      </w:r>
+    </w:p>
+    <w:p>
+      <w:pPr>
+        <w:spacing w:after="100"/>
+        <w:ind w:left="216"/>
+      </w:pPr>
+      <w:r>
+        <w:t>When a renter changes the dispute type or jurisdiction, the application shall update the required questions and selected form template.</w:t>
+      </w:r>
+    </w:p>
+    <w:p>
+      <w:pPr>
+        <w:pStyle w:val="Heading2"/>
+        <w:spacing w:before="80" w:after="20"/>
+      </w:pPr>
+      <w:r>
+        <w:t>FR9</w:t>
+      </w:r>
+    </w:p>
+    <w:p>
+      <w:pPr>
+        <w:spacing w:after="100"/>
+        <w:ind w:left="216"/>
+      </w:pPr>
+      <w:r>
+        <w:t>When a renter enters personal information, the application shall validate required renter identity and contact fields.</w:t>
+      </w:r>
+    </w:p>
+    <w:p>
+      <w:pPr>
+        <w:pStyle w:val="Heading2"/>
+        <w:spacing w:before="80" w:after="20"/>
+      </w:pPr>
+      <w:r>
+        <w:t>FR10</w:t>
+      </w:r>
+    </w:p>
+    <w:p>
+      <w:pPr>
+        <w:spacing w:after="100"/>
+        <w:ind w:left="216"/>
+      </w:pPr>
+      <w:r>
+        <w:t>When a renter enters landlord information, the application shall validate required landlord name and contact fields.</w:t>
+      </w:r>
+    </w:p>
+    <w:p>
+      <w:pPr>
+        <w:pStyle w:val="Heading2"/>
+        <w:spacing w:before="80" w:after="20"/>
+      </w:pPr>
+      <w:r>
+        <w:t>FR11</w:t>
+      </w:r>
+    </w:p>
+    <w:p>
+      <w:pPr>
+        <w:spacing w:after="100"/>
+        <w:ind w:left="216"/>
+      </w:pPr>
+      <w:r>
+        <w:t>When a renter enters property information, the application shall validate required property address fields.</w:t>
+      </w:r>
+    </w:p>
+    <w:p>
+      <w:pPr>
+        <w:pStyle w:val="Heading2"/>
+        <w:spacing w:before="80" w:after="20"/>
+      </w:pPr>
+      <w:r>
+        <w:lastRenderedPageBreak/>
+        <w:t>FR12</w:t>
+      </w:r>
+    </w:p>
+    <w:p>
+      <w:pPr>
+        <w:spacing w:after="100"/>
+        <w:ind w:left="216"/>
+      </w:pPr>
+      <w:r>
+        <w:t>When a renter enters date information, the application shall validate that required dates are present and formatted correctly.</w:t>
+      </w:r>
+    </w:p>
+    <w:p>
+      <w:pPr>
+        <w:pStyle w:val="Heading2"/>
+        <w:spacing w:before="80" w:after="20"/>
+      </w:pPr>
+      <w:r>
+        <w:t>FR13</w:t>
+      </w:r>
+    </w:p>
+    <w:p>
+      <w:pPr>
+        <w:spacing w:after="100"/>
+        <w:ind w:left="216"/>
+      </w:pPr>
+      <w:r>
+        <w:t>When a renter enters money amounts, the application shall validate that the values are numeric and not negative.</w:t>
+      </w:r>
+    </w:p>
+    <w:p>
+      <w:pPr>
+        <w:pStyle w:val="Heading2"/>
+        <w:spacing w:before="80" w:after="20"/>
+      </w:pPr>
+      <w:r>
+        <w:t>FR14</w:t>
+      </w:r>
+    </w:p>
+    <w:p>
+      <w:pPr>
+        <w:spacing w:after="100"/>
+        <w:ind w:left="216"/>
+      </w:pPr>
+      <w:r>
+        <w:t>When a renter leaves required fields blank, the application shall display field-level validation messages before allowing form generation.</w:t>
+      </w:r>
+    </w:p>
+    <w:p>
+      <w:pPr>
+        <w:pStyle w:val="Heading2"/>
+        <w:spacing w:before="80" w:after="20"/>
+      </w:pPr>
+      <w:r>
+        <w:t>FR15</w:t>
+      </w:r>
+    </w:p>
+    <w:p>
+      <w:pPr>
+        <w:spacing w:after="100"/>
+        <w:ind w:left="216"/>
+      </w:pPr>
+      <w:r>
+        <w:t>When a renter provides optional evidence descriptions, the application shall store the descriptions with the dispute case.</w:t>
+      </w:r>
+    </w:p>
+    <w:p>
+      <w:pPr>
+        <w:pStyle w:val="Heading2"/>
+        <w:spacing w:before="80" w:after="20"/>
+      </w:pPr>
+      <w:r>
+        <w:t>FR16</w:t>
+      </w:r>
+    </w:p>
+    <w:p>
+      <w:pPr>
+        <w:spacing w:after="100"/>
+        <w:ind w:left="216"/>
+      </w:pPr>
+      <w:r>
+        <w:t>When a renter uploads supported evidence files, the application shall validate the file type and file size before saving them.</w:t>
+      </w:r>
+    </w:p>
+    <w:p>
+      <w:pPr>
+        <w:pStyle w:val="Heading2"/>
+        <w:spacing w:before="80" w:after="20"/>
+      </w:pPr>
+      <w:r>
+        <w:t>FR17</w:t>
+      </w:r>
+    </w:p>
+    <w:p>
+      <w:pPr>
+        <w:spacing w:after="100"/>
+        <w:ind w:left="216"/>
+      </w:pPr>
+      <w:r>
+        <w:t>When a renter uploads unsupported evidence files, the application shall reject the files and explain the allowed file rules.</w:t>
+      </w:r>
+    </w:p>
+    <w:p>
+      <w:pPr>
+        <w:pStyle w:val="Heading2"/>
+        <w:spacing w:before="80" w:after="20"/>
+      </w:pPr>
+      <w:r>
+        <w:t>FR18</w:t>
+      </w:r>
+    </w:p>
+    <w:p>
+      <w:pPr>
+        <w:spacing w:after="100"/>
+        <w:ind w:left="216"/>
+      </w:pPr>
+      <w:r>
+        <w:t>When a renter requests help drafting a dispute explanation, the application may send renter-provided facts to the AI API to draft plain-language text for renter review.</w:t>
+      </w:r>
+    </w:p>
+    <w:p>
+      <w:pPr>
+        <w:pStyle w:val="Heading2"/>
+        <w:spacing w:before="80" w:after="20"/>
+      </w:pPr>
+      <w:r>
+        <w:t>FR19</w:t>
+      </w:r>
+    </w:p>
+    <w:p>
+      <w:pPr>
+        <w:spacing w:after="100"/>
+        <w:ind w:left="216"/>
+      </w:pPr>
+      <w:r>
+        <w:t>When the AI API returns drafted dispute explanation text, the application shall display the draft to the renter for review and editing before it is used in a form.</w:t>
+      </w:r>
+    </w:p>
+    <w:p>
+      <w:pPr>
+        <w:pStyle w:val="Heading2"/>
+        <w:spacing w:before="80" w:after="20"/>
+      </w:pPr>
+      <w:r>
+        <w:t>FR20</w:t>
+      </w:r>
+    </w:p>
+    <w:p>
+      <w:pPr>
+        <w:spacing w:after="100"/>
+        <w:ind w:left="216"/>
+      </w:pPr>
+      <w:r>
+        <w:t>When the AI API is unavailable during dispute explanation drafting, the application shall allow the renter to continue by writing the explanation manually.</w:t>
+      </w:r>
+    </w:p>
+    <w:p>
+      <w:pPr>
+        <w:pStyle w:val="Heading2"/>
+        <w:spacing w:before="80" w:after="20"/>
+      </w:pPr>
+      <w:r>
+        <w:t>FR21</w:t>
+      </w:r>
+    </w:p>
+    <w:p>
+      <w:pPr>
+        <w:spacing w:after="100"/>
+        <w:ind w:left="216"/>
+      </w:pPr>
+      <w:r>
+        <w:t>When all required form fields are complete, the application shall pre-fill the selected official form or document template with the renter-provided information.</w:t>
+      </w:r>
+    </w:p>
+    <w:p>
+      <w:pPr>
+        <w:pStyle w:val="Heading2"/>
+        <w:spacing w:before="80" w:after="20"/>
+      </w:pPr>
+      <w:r>
+        <w:t>FR22</w:t>
+      </w:r>
+    </w:p>
+    <w:p>
+      <w:pPr>
+        <w:spacing w:after="100"/>
+        <w:ind w:left="216"/>
+      </w:pPr>
+      <w:r>
+        <w:t>When the application pre-fills a form, the application shall preserve the original template structure and place renter answers in the correct fields or sections.</w:t>
+      </w:r>
+    </w:p>
+    <w:p>
+      <w:pPr>
+        <w:pStyle w:val="Heading2"/>
+        <w:spacing w:before="80" w:after="20"/>
+      </w:pPr>
+      <w:r>
+        <w:t>FR23</w:t>
+      </w:r>
+    </w:p>
+    <w:p>
+      <w:pPr>
+        <w:spacing w:after="100"/>
+        <w:ind w:left="216"/>
+      </w:pPr>
+      <w:r>
+        <w:t>When required information is missing for the selected template, the application shall identify the missing fields before generating the final document.</w:t>
+      </w:r>
+    </w:p>
+    <w:p>
+      <w:pPr>
+        <w:pStyle w:val="Heading2"/>
+        <w:spacing w:before="80" w:after="20"/>
+      </w:pPr>
+      <w:r>
+        <w:t>FR24</w:t>
+      </w:r>
+    </w:p>
+    <w:p>
+      <w:pPr>
+        <w:spacing w:after="100"/>
+        <w:ind w:left="216"/>
+      </w:pPr>
+      <w:r>
+        <w:t>When a renter reviews a generated form, the application shall allow the renter to edit answers and regenerate the form.</w:t>
+      </w:r>
+    </w:p>
+    <w:p>
+      <w:pPr>
+        <w:pStyle w:val="Heading2"/>
+        <w:spacing w:before="80" w:after="20"/>
+      </w:pPr>
+      <w:r>
+        <w:lastRenderedPageBreak/>
+        <w:t>FR25</w:t>
+      </w:r>
+    </w:p>
+    <w:p>
+      <w:pPr>
+        <w:spacing w:after="100"/>
+        <w:ind w:left="216"/>
+      </w:pPr>
+      <w:r>
+        <w:t>When a renter confirms the generated form, the application shall allow the renter to download or print the completed document.</w:t>
+      </w:r>
+    </w:p>
+    <w:p>
+      <w:pPr>
+        <w:pStyle w:val="Heading2"/>
+        <w:spacing w:before="80" w:after="20"/>
+      </w:pPr>
+      <w:r>
+        <w:t>FR26</w:t>
+      </w:r>
+    </w:p>
+    <w:p>
+      <w:pPr>
+        <w:spacing w:after="100"/>
+        <w:ind w:left="216"/>
+      </w:pPr>
+      <w:r>
+        <w:t>When a renter saves a form-generation case, the application shall store the case details, selected template, generated document reference, and current case status.</w:t>
+      </w:r>
+    </w:p>
+    <w:p>
+      <w:pPr>
+        <w:pStyle w:val="Heading2"/>
+        <w:spacing w:before="80" w:after="20"/>
+      </w:pPr>
+      <w:r>
+        <w:t>FR27</w:t>
+      </w:r>
+    </w:p>
+    <w:p>
+      <w:pPr>
+        <w:spacing w:after="100"/>
+        <w:ind w:left="216"/>
+      </w:pPr>
+      <w:r>
+        <w:t>When a renter opens an existing case, the application shall retrieve the saved case information and generated document status.</w:t>
+      </w:r>
+    </w:p>
+    <w:p>
+      <w:pPr>
+        <w:pStyle w:val="Heading2"/>
+        <w:spacing w:before="80" w:after="20"/>
+      </w:pPr>
+      <w:r>
+        <w:t>FR28</w:t>
+      </w:r>
+    </w:p>
+    <w:p>
+      <w:pPr>
+        <w:spacing w:after="100"/>
+        <w:ind w:left="216"/>
+      </w:pPr>
+      <w:r>
+        <w:t>When a case does not exist or the case link is invalid, the application shall display a safe not-found or access-denied message.</w:t>
+      </w:r>
+    </w:p>
+    <w:p>
+      <w:pPr>
+        <w:pStyle w:val="Heading2"/>
+        <w:spacing w:before="80" w:after="20"/>
+      </w:pPr>
+      <w:r>
+        <w:t>FR29</w:t>
+      </w:r>
+    </w:p>
+    <w:p>
+      <w:pPr>
+        <w:spacing w:after="100"/>
+        <w:ind w:left="216"/>
+      </w:pPr>
+      <w:r>
+        <w:t>When a renter invites a landlord to respond, the application shall generate a case-specific landlord response link or access method.</w:t>
+      </w:r>
+    </w:p>
+    <w:p>
+      <w:pPr>
+        <w:pStyle w:val="Heading2"/>
+        <w:spacing w:before="80" w:after="20"/>
+      </w:pPr>
+      <w:r>
+        <w:t>FR30</w:t>
+      </w:r>
+    </w:p>
+    <w:p>
+      <w:pPr>
+        <w:spacing w:after="100"/>
+        <w:ind w:left="216"/>
+      </w:pPr>
+      <w:r>
+        <w:t>When a landlord opens a valid response link, the application shall display the renter claim summary and response form.</w:t>
+      </w:r>
+    </w:p>
+    <w:p>
+      <w:pPr>
+        <w:pStyle w:val="Heading2"/>
+        <w:spacing w:before="80" w:after="20"/>
+      </w:pPr>
+      <w:r>
+        <w:t>FR31</w:t>
+      </w:r>
+    </w:p>
+    <w:p>
+      <w:pPr>
+        <w:spacing w:after="100"/>
+        <w:ind w:left="216"/>
+      </w:pPr>
+      <w:r>
+        <w:t>When a landlord opens an invalid or expired response link, the application shall deny access to the case information.</w:t>
+      </w:r>
+    </w:p>
+    <w:p>
+      <w:pPr>
+        <w:pStyle w:val="Heading2"/>
+        <w:spacing w:before="80" w:after="20"/>
+      </w:pPr>
+      <w:r>
+        <w:t>FR32</w:t>
+      </w:r>
+    </w:p>
+    <w:p>
+      <w:pPr>
+        <w:spacing w:after="100"/>
+        <w:ind w:left="216"/>
+      </w:pPr>
+      <w:r>
+        <w:t>When a landlord submits a response, the application shall validate required landlord response fields before saving the response.</w:t>
+      </w:r>
+    </w:p>
+    <w:p>
+      <w:pPr>
+        <w:pStyle w:val="Heading2"/>
+        <w:spacing w:before="80" w:after="20"/>
+      </w:pPr>
+      <w:r>
+        <w:t>FR33</w:t>
+      </w:r>
+    </w:p>
+    <w:p>
+      <w:pPr>
+        <w:spacing w:after="100"/>
+        <w:ind w:left="216"/>
+      </w:pPr>
+      <w:r>
+        <w:t>When a landlord submits valid response information, the application shall save the landlord response with the related dispute case.</w:t>
+      </w:r>
+    </w:p>
+    <w:p>
+      <w:pPr>
+        <w:pStyle w:val="Heading2"/>
+        <w:spacing w:before="80" w:after="20"/>
+      </w:pPr>
+      <w:r>
+        <w:t>FR34</w:t>
+      </w:r>
+    </w:p>
+    <w:p>
+      <w:pPr>
+        <w:spacing w:after="100"/>
+        <w:ind w:left="216"/>
+      </w:pPr>
+      <w:r>
+        <w:t>When both renter information and landlord response information are available, the application shall allow an AI arbitration request to be started.</w:t>
+      </w:r>
+    </w:p>
+    <w:p>
+      <w:pPr>
+        <w:pStyle w:val="Heading2"/>
+        <w:spacing w:before="80" w:after="20"/>
+      </w:pPr>
+      <w:r>
+        <w:t>FR35</w:t>
+      </w:r>
+    </w:p>
+    <w:p>
+      <w:pPr>
+        <w:spacing w:after="100"/>
+        <w:ind w:left="216"/>
+      </w:pPr>
+      <w:r>
+        <w:t>When a user requests AI arbitration before both sides are available, the application shall explain which side or information is missing.</w:t>
+      </w:r>
+    </w:p>
+    <w:p>
+      <w:pPr>
+        <w:pStyle w:val="Heading2"/>
+        <w:spacing w:before="80" w:after="20"/>
+      </w:pPr>
+      <w:r>
+        <w:t>FR36</w:t>
+      </w:r>
+    </w:p>
+    <w:p>
+      <w:pPr>
+        <w:spacing w:after="100"/>
+        <w:ind w:left="216"/>
+      </w:pPr>
+      <w:r>
+        <w:t>When AI arbitration is requested, the application shall send the renter claims, landlord response, evidence descriptions, and case context to the AI API.</w:t>
+      </w:r>
+    </w:p>
+    <w:p>
+      <w:pPr>
+        <w:pStyle w:val="Heading2"/>
+        <w:spacing w:before="80" w:after="20"/>
+      </w:pPr>
+      <w:r>
+        <w:t>FR37</w:t>
+      </w:r>
+    </w:p>
+    <w:p>
+      <w:pPr>
+        <w:spacing w:after="100"/>
+        <w:ind w:left="216"/>
+      </w:pPr>
+      <w:r>
+        <w:t>When the AI API returns an arbitration response, the application shall display a neutral dispute summary, each side’s main claims, key disputed facts, missing evidence, and suggested resolution.</w:t>
+      </w:r>
+    </w:p>
+    <w:p>
+      <w:pPr>
+        <w:pStyle w:val="Heading2"/>
+        <w:spacing w:before="80" w:after="20"/>
+      </w:pPr>
+      <w:r>
+        <w:lastRenderedPageBreak/>
+        <w:t>FR38</w:t>
+      </w:r>
+    </w:p>
+    <w:p>
+      <w:pPr>
+        <w:spacing w:after="100"/>
+        <w:ind w:left="216"/>
+      </w:pPr>
+      <w:r>
+        <w:t>When the AI API response does not include required arbitration sections, the application shall display an error or request regeneration instead of showing an incomplete result as final.</w:t>
+      </w:r>
+    </w:p>
+    <w:p>
+      <w:pPr>
+        <w:pStyle w:val="Heading2"/>
+        <w:spacing w:before="80" w:after="20"/>
+      </w:pPr>
+      <w:r>
+        <w:t>FR39</w:t>
+      </w:r>
+    </w:p>
+    <w:p>
+      <w:pPr>
+        <w:spacing w:after="100"/>
+        <w:ind w:left="216"/>
+      </w:pPr>
+      <w:r>
+        <w:t>When the AI API is unavailable during arbitration, the application shall show a retry option and preserve all submitted case information.</w:t>
+      </w:r>
+    </w:p>
+    <w:p>
+      <w:pPr>
+        <w:pStyle w:val="Heading2"/>
+        <w:spacing w:before="80" w:after="20"/>
+      </w:pPr>
+      <w:r>
+        <w:t>FR40</w:t>
+      </w:r>
+    </w:p>
+    <w:p>
+      <w:pPr>
+        <w:spacing w:after="100"/>
+        <w:ind w:left="216"/>
+      </w:pPr>
+      <w:r>
+        <w:t>When an AI arbitration result is displayed, the application shall include a disclaimer that the result is not legal advice and is not an official decision.</w:t>
+      </w:r>
+    </w:p>
+    <w:p>
+      <w:pPr>
+        <w:pStyle w:val="Heading2"/>
+        <w:spacing w:before="80" w:after="20"/>
+      </w:pPr>
+      <w:r>
+        <w:t>FR41</w:t>
+      </w:r>
+    </w:p>
+    <w:p>
+      <w:pPr>
+        <w:spacing w:after="100"/>
+        <w:ind w:left="216"/>
+      </w:pPr>
+      <w:r>
+        <w:t>When an AI arbitration result is accepted for saving, the application shall store the generated summary, disputed facts, missing evidence, suggested resolution, and timestamp.</w:t>
+      </w:r>
+    </w:p>
+    <w:p>
+      <w:pPr>
+        <w:pStyle w:val="Heading2"/>
+        <w:spacing w:before="80" w:after="20"/>
+      </w:pPr>
+      <w:r>
+        <w:t>FR42</w:t>
+      </w:r>
+    </w:p>
+    <w:p>
+      <w:pPr>
+        <w:spacing w:after="100"/>
+        <w:ind w:left="216"/>
+      </w:pPr>
+      <w:r>
+        <w:t>When a user views a completed case, the application shall display the generated official form status, renter claim, landlord response, and AI arbitration result when available.</w:t>
+      </w:r>
+    </w:p>
+    <w:p>
+      <w:pPr>
+        <w:pStyle w:val="Heading2"/>
+        <w:spacing w:before="80" w:after="20"/>
+      </w:pPr>
+      <w:r>
+        <w:t>FR43</w:t>
+      </w:r>
+    </w:p>
+    <w:p>
+      <w:pPr>
+        <w:spacing w:after="100"/>
+        <w:ind w:left="216"/>
+      </w:pPr>
+      <w:r>
+        <w:t>When a user attempts to access another case without valid permission, the application shall block access to that case.</w:t>
+      </w:r>
+    </w:p>
+    <w:p>
+      <w:pPr>
+        <w:pStyle w:val="Heading2"/>
+        <w:spacing w:before="80" w:after="20"/>
+      </w:pPr>
+      <w:r>
+        <w:t>FR44</w:t>
+      </w:r>
+    </w:p>
+    <w:p>
+      <w:pPr>
+        <w:spacing w:after="100"/>
+        <w:ind w:left="216"/>
+      </w:pPr>
+      <w:r>
+        <w:t>When the application records errors, the application shall avoid exposing private user information or sensitive system details in the user interface.</w:t>
+      </w:r>
+    </w:p>
+    <w:p>
+      <w:pPr>
+        <w:pStyle w:val="Heading2"/>
+        <w:spacing w:before="80" w:after="20"/>
+      </w:pPr>
+      <w:r>
+        <w:t>FR45</w:t>
+      </w:r>
+    </w:p>
+    <w:p>
+      <w:pPr>
+        <w:spacing w:after="100"/>
+        <w:ind w:left="216"/>
+      </w:pPr>
+      <w:r>
+        <w:t>When the team demonstrates the MVP, the application shall support the complete flow from renter intake to form download to landlord response to AI arbitration result.</w:t>
+      </w:r>
+    </w:p>
     <w:sectPr>
+      <w:footerReference w:type="default" r:id="rId8"/>
       <w:pgSz w:w="12240" w:h="15840"/>
-      <w:pgMar w:top="936" w:right="936" w:bottom="936" w:left="936" w:header="720" w:footer="720" w:gutter="0"/>
+      <w:pgMar w:top="792" w:right="936" w:bottom="792" w:left="936" w:header="720" w:footer="720" w:gutter="0"/>
       <w:cols w:space="720"/>
       <w:docGrid w:linePitch="360"/>
     </w:sectPr>
   </w:body>
 </w:document>
+</file>
+
+<file path=word/endnotes.xml><?xml version="1.0" encoding="utf-8"?>
+<w:endnotes xmlns:wpc="http://schemas.microsoft.com/office/word/2010/wordprocessingCanvas" xmlns:cx="http://schemas.microsoft.com/office/drawing/2014/chartex" xmlns:cx1="http://schemas.microsoft.com/office/drawing/2015/9/8/chartex" xmlns:cx2="http://schemas.microsoft.com/office/drawing/2015/10/21/chartex" xmlns:cx3="http://schemas.microsoft.com/office/drawing/2016/5/9/chartex" xmlns:cx4="http://schemas.microsoft.com/office/drawing/2016/5/10/chartex" xmlns:cx5="http://schemas.microsoft.com/office/drawing/2016/5/11/chartex" xmlns:cx6="http://schemas.microsoft.com/office/drawing/2016/5/12/chartex" xmlns:cx7="http://schemas.microsoft.com/office/drawing/2016/5/13/chartex" xmlns:cx8="http://schemas.microsoft.com/office/drawing/2016/5/14/chartex" xmlns:mc="http://schemas.openxmlformats.org/markup-compatibility/2006" xmlns:aink="http://schemas.microsoft.com/office/drawing/2016/ink" xmlns:am3d="http://schemas.microsoft.com/office/drawing/2017/model3d" xmlns:o="urn:schemas-microsoft-com:office:office" xmlns:oel="http://schemas.microsoft.com/office/2019/extlst" xmlns:r="http://schemas.openxmlformats.org/officeDocument/2006/relationships" xmlns:m="http://schemas.openxmlformats.org/officeDocument/2006/math" xmlns:v="urn:schemas-microsoft-com:vml" xmlns:wp14="http://schemas.microsoft.com/office/word/2010/wordprocessingDrawing" xmlns:wp="http://schemas.openxmlformats.org/drawingml/2006/wordprocessingDrawing" xmlns:w10="urn:schemas-microsoft-com:office:word" xmlns:w="http://schemas.openxmlformats.org/wordprocessingml/2006/main" xmlns:w14="http://schemas.microsoft.com/office/word/2010/wordml" xmlns:w15="http://schemas.microsoft.com/office/word/2012/wordml" xmlns:w16cex="http://schemas.microsoft.com/office/word/2018/wordml/cex" xmlns:w16cid="http://schemas.microsoft.com/office/word/2016/wordml/cid" xmlns:w16="http://schemas.microsoft.com/office/word/2018/wordml" xmlns:w16du="http://schemas.microsoft.com/office/word/2023/wordml/word16du" xmlns:w16sdtdh="http://schemas.microsoft.com/office/word/2020/wordml/sdtdatahash" xmlns:w16sdtfl="http://schemas.microsoft.com/office/word/2024/wordml/sdtformatlock" xmlns:w16se="http://schemas.microsoft.com/office/word/2015/wordml/symex" xmlns:wpg="http://schemas.microsoft.com/office/word/2010/wordprocessingGroup" xmlns:wpi="http://schemas.microsoft.com/office/word/2010/wordprocessingInk" xmlns:wne="http://schemas.microsoft.com/office/word/2006/wordml" xmlns:wps="http://schemas.microsoft.com/office/word/2010/wordprocessingShape" mc:Ignorable="w14 w15 w16se w16cid w16 w16cex w16sdtdh w16sdtfl w16du wp14">
+  <w:endnote w:type="separator" w:id="-1">
+    <w:p>
+      <w:pPr>
+        <w:spacing w:after="0" w:line="240" w:lineRule="auto"/>
+      </w:pPr>
+      <w:r>
+        <w:separator/>
+      </w:r>
+    </w:p>
+  </w:endnote>
+  <w:endnote w:type="continuationSeparator" w:id="0">
+    <w:p>
+      <w:pPr>
+        <w:spacing w:after="0" w:line="240" w:lineRule="auto"/>
+      </w:pPr>
+      <w:r>
+        <w:continuationSeparator/>
+      </w:r>
+    </w:p>
+  </w:endnote>
+</w:endnotes>
+</file>
+
+<file path=word/footer1.xml><?xml version="1.0" encoding="utf-8"?>
+<w:ftr xmlns:wpc="http://schemas.microsoft.com/office/word/2010/wordprocessingCanvas" xmlns:cx="http://schemas.microsoft.com/office/drawing/2014/chartex" xmlns:cx1="http://schemas.microsoft.com/office/drawing/2015/9/8/chartex" xmlns:cx2="http://schemas.microsoft.com/office/drawing/2015/10/21/chartex" xmlns:cx3="http://schemas.microsoft.com/office/drawing/2016/5/9/chartex" xmlns:cx4="http://schemas.microsoft.com/office/drawing/2016/5/10/chartex" xmlns:cx5="http://schemas.microsoft.com/office/drawing/2016/5/11/chartex" xmlns:cx6="http://schemas.microsoft.com/office/drawing/2016/5/12/chartex" xmlns:cx7="http://schemas.microsoft.com/office/drawing/2016/5/13/chartex" xmlns:cx8="http://schemas.microsoft.com/office/drawing/2016/5/14/chartex" xmlns:mc="http://schemas.openxmlformats.org/markup-compatibility/2006" xmlns:aink="http://schemas.microsoft.com/office/drawing/2016/ink" xmlns:am3d="http://schemas.microsoft.com/office/drawing/2017/model3d" xmlns:o="urn:schemas-microsoft-com:office:office" xmlns:oel="http://schemas.microsoft.com/office/2019/extlst" xmlns:r="http://schemas.openxmlformats.org/officeDocument/2006/relationships" xmlns:m="http://schemas.openxmlformats.org/officeDocument/2006/math" xmlns:v="urn:schemas-microsoft-com:vml" xmlns:wp14="http://schemas.microsoft.com/office/word/2010/wordprocessingDrawing" xmlns:wp="http://schemas.openxmlformats.org/drawingml/2006/wordprocessingDrawing" xmlns:w10="urn:schemas-microsoft-com:office:word" xmlns:w="http://schemas.openxmlformats.org/wordprocessingml/2006/main" xmlns:w14="http://schemas.microsoft.com/office/word/2010/wordml" xmlns:w15="http://schemas.microsoft.com/office/word/2012/wordml" xmlns:w16cex="http://schemas.microsoft.com/office/word/2018/wordml/cex" xmlns:w16cid="http://schemas.microsoft.com/office/word/2016/wordml/cid" xmlns:w16="http://schemas.microsoft.com/office/word/2018/wordml" xmlns:w16du="http://schemas.microsoft.com/office/word/2023/wordml/word16du" xmlns:w16sdtdh="http://schemas.microsoft.com/office/word/2020/wordml/sdtdatahash" xmlns:w16sdtfl="http://schemas.microsoft.com/office/word/2024/wordml/sdtformatlock" xmlns:w16se="http://schemas.microsoft.com/office/word/2015/wordml/symex" xmlns:wpg="http://schemas.microsoft.com/office/word/2010/wordprocessingGroup" xmlns:wpi="http://schemas.microsoft.com/office/word/2010/wordprocessingInk" xmlns:wne="http://schemas.microsoft.com/office/word/2006/wordml" xmlns:wps="http://schemas.microsoft.com/office/word/2010/wordprocessingShape" mc:Ignorable="w14 w15 w16se w16cid w16 w16cex w16sdtdh w16sdtfl w16du wp14">
+  <w:p>
+    <w:pPr>
+      <w:pStyle w:val="Footer"/>
+      <w:jc w:val="center"/>
+    </w:pPr>
+    <w:r>
+      <w:rPr>
+        <w:color w:val="666666"/>
+        <w:sz w:val="16"/>
+      </w:rPr>
+      <w:t>CSCI370 Renter Dispute Assistant - Functional / Software Requirements</w:t>
+    </w:r>
+  </w:p>
+</w:ftr>
+</file>
+
+<file path=word/footnotes.xml><?xml version="1.0" encoding="utf-8"?>
+<w:footnotes xmlns:wpc="http://schemas.microsoft.com/office/word/2010/wordprocessingCanvas" xmlns:cx="http://schemas.microsoft.com/office/drawing/2014/chartex" xmlns:cx1="http://schemas.microsoft.com/office/drawing/2015/9/8/chartex" xmlns:cx2="http://schemas.microsoft.com/office/drawing/2015/10/21/chartex" xmlns:cx3="http://schemas.microsoft.com/office/drawing/2016/5/9/chartex" xmlns:cx4="http://schemas.microsoft.com/office/drawing/2016/5/10/chartex" xmlns:cx5="http://schemas.microsoft.com/office/drawing/2016/5/11/chartex" xmlns:cx6="http://schemas.microsoft.com/office/drawing/2016/5/12/chartex" xmlns:cx7="http://schemas.microsoft.com/office/drawing/2016/5/13/chartex" xmlns:cx8="http://schemas.microsoft.com/office/drawing/2016/5/14/chartex" xmlns:mc="http://schemas.openxmlformats.org/markup-compatibility/2006" xmlns:aink="http://schemas.microsoft.com/office/drawing/2016/ink" xmlns:am3d="http://schemas.microsoft.com/office/drawing/2017/model3d" xmlns:o="urn:schemas-microsoft-com:office:office" xmlns:oel="http://schemas.microsoft.com/office/2019/extlst" xmlns:r="http://schemas.openxmlformats.org/officeDocument/2006/relationships" xmlns:m="http://schemas.openxmlformats.org/officeDocument/2006/math" xmlns:v="urn:schemas-microsoft-com:vml" xmlns:wp14="http://schemas.microsoft.com/office/word/2010/wordprocessingDrawing" xmlns:wp="http://schemas.openxmlformats.org/drawingml/2006/wordprocessingDrawing" xmlns:w10="urn:schemas-microsoft-com:office:word" xmlns:w="http://schemas.openxmlformats.org/wordprocessingml/2006/main" xmlns:w14="http://schemas.microsoft.com/office/word/2010/wordml" xmlns:w15="http://schemas.microsoft.com/office/word/2012/wordml" xmlns:w16cex="http://schemas.microsoft.com/office/word/2018/wordml/cex" xmlns:w16cid="http://schemas.microsoft.com/office/word/2016/wordml/cid" xmlns:w16="http://schemas.microsoft.com/office/word/2018/wordml" xmlns:w16du="http://schemas.microsoft.com/office/word/2023/wordml/word16du" xmlns:w16sdtdh="http://schemas.microsoft.com/office/word/2020/wordml/sdtdatahash" xmlns:w16sdtfl="http://schemas.microsoft.com/office/word/2024/wordml/sdtformatlock" xmlns:w16se="http://schemas.microsoft.com/office/word/2015/wordml/symex" xmlns:wpg="http://schemas.microsoft.com/office/word/2010/wordprocessingGroup" xmlns:wpi="http://schemas.microsoft.com/office/word/2010/wordprocessingInk" xmlns:wne="http://schemas.microsoft.com/office/word/2006/wordml" xmlns:wps="http://schemas.microsoft.com/office/word/2010/wordprocessingShape" mc:Ignorable="w14 w15 w16se w16cid w16 w16cex w16sdtdh w16sdtfl w16du wp14">
+  <w:footnote w:type="separator" w:id="-1">
+    <w:p>
+      <w:pPr>
+        <w:spacing w:after="0" w:line="240" w:lineRule="auto"/>
+      </w:pPr>
+      <w:r>
+        <w:separator/>
+      </w:r>
+    </w:p>
+  </w:footnote>
+  <w:footnote w:type="continuationSeparator" w:id="0">
+    <w:p>
+      <w:pPr>
+        <w:spacing w:after="0" w:line="240" w:lineRule="auto"/>
+      </w:pPr>
+      <w:r>
+        <w:continuationSeparator/>
+      </w:r>
+    </w:p>
+  </w:footnote>
+</w:footnotes>
 </file>
 
 <file path=word/numbering.xml><?xml version="1.0" encoding="utf-8"?>
@@ -1009,31 +1100,31 @@
       </w:rPr>
     </w:lvl>
   </w:abstractNum>
-  <w:num w:numId="1" w16cid:durableId="1323776249">
+  <w:num w:numId="1" w16cid:durableId="1379818291">
     <w:abstractNumId w:val="8"/>
   </w:num>
-  <w:num w:numId="2" w16cid:durableId="446391990">
+  <w:num w:numId="2" w16cid:durableId="2125534321">
     <w:abstractNumId w:val="6"/>
   </w:num>
-  <w:num w:numId="3" w16cid:durableId="347106135">
+  <w:num w:numId="3" w16cid:durableId="352995815">
     <w:abstractNumId w:val="5"/>
   </w:num>
-  <w:num w:numId="4" w16cid:durableId="2131899321">
+  <w:num w:numId="4" w16cid:durableId="1771003120">
     <w:abstractNumId w:val="4"/>
   </w:num>
-  <w:num w:numId="5" w16cid:durableId="28846968">
+  <w:num w:numId="5" w16cid:durableId="1183589835">
     <w:abstractNumId w:val="7"/>
   </w:num>
-  <w:num w:numId="6" w16cid:durableId="88161399">
+  <w:num w:numId="6" w16cid:durableId="1199050364">
     <w:abstractNumId w:val="3"/>
   </w:num>
-  <w:num w:numId="7" w16cid:durableId="778723658">
+  <w:num w:numId="7" w16cid:durableId="1753508847">
     <w:abstractNumId w:val="2"/>
   </w:num>
-  <w:num w:numId="8" w16cid:durableId="185797642">
+  <w:num w:numId="8" w16cid:durableId="1001617858">
     <w:abstractNumId w:val="1"/>
   </w:num>
-  <w:num w:numId="9" w16cid:durableId="899678240">
+  <w:num w:numId="9" w16cid:durableId="1827626379">
     <w:abstractNumId w:val="0"/>
   </w:num>
 </w:numbering>
@@ -1430,8 +1521,8 @@
     <w:qFormat/>
     <w:rsid w:val="00FC693F"/>
     <w:rPr>
-      <w:rFonts w:ascii="Arial" w:hAnsi="Arial"/>
-      <w:sz w:val="20"/>
+      <w:rFonts w:ascii="Aptos" w:eastAsia="Aptos" w:hAnsi="Aptos"/>
+      <w:sz w:val="21"/>
     </w:rPr>
   </w:style>
   <w:style w:type="paragraph" w:styleId="Heading1">
@@ -1453,7 +1544,7 @@
       <w:b/>
       <w:bCs/>
       <w:color w:val="1F4E79"/>
-      <w:sz w:val="32"/>
+      <w:sz w:val="30"/>
       <w:szCs w:val="28"/>
     </w:rPr>
   </w:style>
@@ -1477,7 +1568,7 @@
       <w:b/>
       <w:bCs/>
       <w:color w:val="1F4E79"/>
-      <w:sz w:val="26"/>
+      <w:sz w:val="24"/>
       <w:szCs w:val="26"/>
     </w:rPr>
   </w:style>
@@ -1501,6 +1592,7 @@
       <w:b/>
       <w:bCs/>
       <w:color w:val="1F4E79"/>
+      <w:sz w:val="22"/>
     </w:rPr>
   </w:style>
   <w:style w:type="paragraph" w:styleId="Heading4">
@@ -1614,6 +1706,7 @@
     <w:rPr>
       <w:rFonts w:asciiTheme="majorHAnsi" w:eastAsiaTheme="majorEastAsia" w:hAnsiTheme="majorHAnsi" w:cstheme="majorBidi"/>
       <w:color w:val="4F81BD" w:themeColor="accent1"/>
+      <w:sz w:val="20"/>
       <w:szCs w:val="20"/>
     </w:rPr>
   </w:style>
@@ -1638,6 +1731,7 @@
       <w:i/>
       <w:iCs/>
       <w:color w:val="404040" w:themeColor="text1" w:themeTint="BF"/>
+      <w:sz w:val="20"/>
       <w:szCs w:val="20"/>
     </w:rPr>
   </w:style>
@@ -1781,10 +1875,10 @@
     </w:pPr>
     <w:rPr>
       <w:rFonts w:asciiTheme="majorHAnsi" w:eastAsiaTheme="majorEastAsia" w:hAnsiTheme="majorHAnsi" w:cstheme="majorBidi"/>
-      <w:color w:val="17365D" w:themeColor="text2" w:themeShade="BF"/>
+      <w:color w:val="1F4E79"/>
       <w:spacing w:val="5"/>
       <w:kern w:val="28"/>
-      <w:sz w:val="52"/>
+      <w:sz w:val="44"/>
       <w:szCs w:val="52"/>
     </w:rPr>
   </w:style>

</xml_diff>